<commit_message>
The API changed to fetch data in seq rather than fetching in snapshot
</commit_message>
<xml_diff>
--- a/WITSML.docx
+++ b/WITSML.docx
@@ -87,7 +87,39 @@
       <w:r>
         <w:t xml:space="preserve"> </w:t>
       </w:r>
+      <w:r>
+        <w:t>This project simulates a WITSML-style real-time drilling log source. The API produces time-indexed drilling log rows with well, wellbore, log, mnemonics, units, and measurement values. The producer tracks the last processed sequence number and sends only new log rows to Kafka.</w:t>
+      </w:r>
     </w:p>
+    <w:p/>
+    <w:p/>
+    <w:p>
+      <w:pPr>
+        <w:pStyle w:val="Heading1"/>
+      </w:pPr>
+      <w:r>
+        <w:t>Future Improvement</w:t>
+      </w:r>
+      <w:r>
+        <w:t>:</w:t>
+      </w:r>
+    </w:p>
+    <w:p>
+      <w:pPr>
+        <w:pStyle w:val="ListParagraph"/>
+        <w:numPr>
+          <w:ilvl w:val="0"/>
+          <w:numId w:val="2"/>
+        </w:numPr>
+      </w:pPr>
+      <w:r>
+        <w:t>R</w:t>
+      </w:r>
+      <w:r>
+        <w:t>eplace the simulated REST polling API with an ETP/WITSML source connector.</w:t>
+      </w:r>
+    </w:p>
+    <w:p/>
     <w:sectPr>
       <w:pgSz w:w="12240" w:h="15840"/>
       <w:pgMar w:top="1440" w:right="1440" w:bottom="1440" w:left="1440" w:header="720" w:footer="720" w:gutter="0"/>
@@ -101,6 +133,95 @@
 <file path=word/numbering.xml><?xml version="1.0" encoding="utf-8"?>
 <w:numbering xmlns:wpc="http://schemas.microsoft.com/office/word/2010/wordprocessingCanvas" xmlns:cx="http://schemas.microsoft.com/office/drawing/2014/chartex" xmlns:cx1="http://schemas.microsoft.com/office/drawing/2015/9/8/chartex" xmlns:cx2="http://schemas.microsoft.com/office/drawing/2015/10/21/chartex" xmlns:cx3="http://schemas.microsoft.com/office/drawing/2016/5/9/chartex" xmlns:cx4="http://schemas.microsoft.com/office/drawing/2016/5/10/chartex" xmlns:cx5="http://schemas.microsoft.com/office/drawing/2016/5/11/chartex" xmlns:cx6="http://schemas.microsoft.com/office/drawing/2016/5/12/chartex" xmlns:cx7="http://schemas.microsoft.com/office/drawing/2016/5/13/chartex" xmlns:cx8="http://schemas.microsoft.com/office/drawing/2016/5/14/chartex" xmlns:mc="http://schemas.openxmlformats.org/markup-compatibility/2006" xmlns:aink="http://schemas.microsoft.com/office/drawing/2016/ink" xmlns:am3d="http://schemas.microsoft.com/office/drawing/2017/model3d" xmlns:o="urn:schemas-microsoft-com:office:office" xmlns:oel="http://schemas.microsoft.com/office/2019/extlst" xmlns:r="http://schemas.openxmlformats.org/officeDocument/2006/relationships" xmlns:m="http://schemas.openxmlformats.org/officeDocument/2006/math" xmlns:v="urn:schemas-microsoft-com:vml" xmlns:wp14="http://schemas.microsoft.com/office/word/2010/wordprocessingDrawing" xmlns:wp="http://schemas.openxmlformats.org/drawingml/2006/wordprocessingDrawing" xmlns:w10="urn:schemas-microsoft-com:office:word" xmlns:w="http://schemas.openxmlformats.org/wordprocessingml/2006/main" xmlns:w14="http://schemas.microsoft.com/office/word/2010/wordml" xmlns:w15="http://schemas.microsoft.com/office/word/2012/wordml" xmlns:w16cex="http://schemas.microsoft.com/office/word/2018/wordml/cex" xmlns:w16cid="http://schemas.microsoft.com/office/word/2016/wordml/cid" xmlns:w16="http://schemas.microsoft.com/office/word/2018/wordml" xmlns:w16du="http://schemas.microsoft.com/office/word/2023/wordml/word16du" xmlns:w16sdtdh="http://schemas.microsoft.com/office/word/2020/wordml/sdtdatahash" xmlns:w16sdtfl="http://schemas.microsoft.com/office/word/2024/wordml/sdtformatlock" xmlns:w16se="http://schemas.microsoft.com/office/word/2015/wordml/symex" xmlns:wpg="http://schemas.microsoft.com/office/word/2010/wordprocessingGroup" xmlns:wpi="http://schemas.microsoft.com/office/word/2010/wordprocessingInk" xmlns:wne="http://schemas.microsoft.com/office/word/2006/wordml" xmlns:wps="http://schemas.microsoft.com/office/word/2010/wordprocessingShape" mc:Ignorable="w14 w15 w16se w16cid w16 w16cex w16sdtdh w16sdtfl w16du wp14">
   <w:abstractNum w:abstractNumId="0" w15:restartNumberingAfterBreak="0">
+    <w:nsid w:val="024E15D2"/>
+    <w:multiLevelType w:val="hybridMultilevel"/>
+    <w:tmpl w:val="C900B280"/>
+    <w:lvl w:ilvl="0" w:tplc="0409000F">
+      <w:start w:val="1"/>
+      <w:numFmt w:val="decimal"/>
+      <w:lvlText w:val="%1."/>
+      <w:lvlJc w:val="left"/>
+      <w:pPr>
+        <w:ind w:left="720" w:hanging="360"/>
+      </w:pPr>
+      <w:rPr>
+        <w:rFonts w:hint="default"/>
+      </w:rPr>
+    </w:lvl>
+    <w:lvl w:ilvl="1" w:tplc="04090019" w:tentative="1">
+      <w:start w:val="1"/>
+      <w:numFmt w:val="lowerLetter"/>
+      <w:lvlText w:val="%2."/>
+      <w:lvlJc w:val="left"/>
+      <w:pPr>
+        <w:ind w:left="1440" w:hanging="360"/>
+      </w:pPr>
+    </w:lvl>
+    <w:lvl w:ilvl="2" w:tplc="0409001B" w:tentative="1">
+      <w:start w:val="1"/>
+      <w:numFmt w:val="lowerRoman"/>
+      <w:lvlText w:val="%3."/>
+      <w:lvlJc w:val="right"/>
+      <w:pPr>
+        <w:ind w:left="2160" w:hanging="180"/>
+      </w:pPr>
+    </w:lvl>
+    <w:lvl w:ilvl="3" w:tplc="0409000F" w:tentative="1">
+      <w:start w:val="1"/>
+      <w:numFmt w:val="decimal"/>
+      <w:lvlText w:val="%4."/>
+      <w:lvlJc w:val="left"/>
+      <w:pPr>
+        <w:ind w:left="2880" w:hanging="360"/>
+      </w:pPr>
+    </w:lvl>
+    <w:lvl w:ilvl="4" w:tplc="04090019" w:tentative="1">
+      <w:start w:val="1"/>
+      <w:numFmt w:val="lowerLetter"/>
+      <w:lvlText w:val="%5."/>
+      <w:lvlJc w:val="left"/>
+      <w:pPr>
+        <w:ind w:left="3600" w:hanging="360"/>
+      </w:pPr>
+    </w:lvl>
+    <w:lvl w:ilvl="5" w:tplc="0409001B" w:tentative="1">
+      <w:start w:val="1"/>
+      <w:numFmt w:val="lowerRoman"/>
+      <w:lvlText w:val="%6."/>
+      <w:lvlJc w:val="right"/>
+      <w:pPr>
+        <w:ind w:left="4320" w:hanging="180"/>
+      </w:pPr>
+    </w:lvl>
+    <w:lvl w:ilvl="6" w:tplc="0409000F" w:tentative="1">
+      <w:start w:val="1"/>
+      <w:numFmt w:val="decimal"/>
+      <w:lvlText w:val="%7."/>
+      <w:lvlJc w:val="left"/>
+      <w:pPr>
+        <w:ind w:left="5040" w:hanging="360"/>
+      </w:pPr>
+    </w:lvl>
+    <w:lvl w:ilvl="7" w:tplc="04090019" w:tentative="1">
+      <w:start w:val="1"/>
+      <w:numFmt w:val="lowerLetter"/>
+      <w:lvlText w:val="%8."/>
+      <w:lvlJc w:val="left"/>
+      <w:pPr>
+        <w:ind w:left="5760" w:hanging="360"/>
+      </w:pPr>
+    </w:lvl>
+    <w:lvl w:ilvl="8" w:tplc="0409001B" w:tentative="1">
+      <w:start w:val="1"/>
+      <w:numFmt w:val="lowerRoman"/>
+      <w:lvlText w:val="%9."/>
+      <w:lvlJc w:val="right"/>
+      <w:pPr>
+        <w:ind w:left="6480" w:hanging="180"/>
+      </w:pPr>
+    </w:lvl>
+  </w:abstractNum>
+  <w:abstractNum w:abstractNumId="1" w15:restartNumberingAfterBreak="0">
     <w:nsid w:val="600024D3"/>
     <w:multiLevelType w:val="hybridMultilevel"/>
     <w:tmpl w:val="5E1CB1C4"/>
@@ -190,6 +311,9 @@
     </w:lvl>
   </w:abstractNum>
   <w:num w:numId="1" w16cid:durableId="580412623">
+    <w:abstractNumId w:val="1"/>
+  </w:num>
+  <w:num w:numId="2" w16cid:durableId="373507348">
     <w:abstractNumId w:val="0"/>
   </w:num>
 </w:numbering>

</xml_diff>

<commit_message>
I add the Schema Registry
</commit_message>
<xml_diff>
--- a/WITSML.docx
+++ b/WITSML.docx
@@ -43,7 +43,15 @@
     </w:p>
     <w:p>
       <w:r>
-        <w:t>WITSML (Wellsite Information Transfer Standard Markup Language) is an industry-standard data exchange format used in the oil and gas sector to transfer drilling and wellsite data from rig systems and field tools to end users and operational platforms. It provides a standardized structure for sharing real-time well data between different companies, software systems, and service providers, enabling seamless integration, reducing data inconsistencies, and improving communication and operational efficiency across petroleum operations.</w:t>
+        <w:t>WITSML (Wellsite Information Transfer Standard Markup Language) is an industry-standard data exchange format used in the oil and gas sector to transfer drilling and wellsite data from rig systems and field tools to end users and operational platforms. It provides a standardized structure for sharing real-</w:t>
+      </w:r>
+      <w:proofErr w:type="gramStart"/>
+      <w:r>
+        <w:t>time well</w:t>
+      </w:r>
+      <w:proofErr w:type="gramEnd"/>
+      <w:r>
+        <w:t xml:space="preserve"> data between different companies, software systems, and service providers, enabling seamless integration, reducing data inconsistencies, and improving communication and operational efficiency across petroleum operations.</w:t>
       </w:r>
     </w:p>
     <w:p/>
@@ -92,16 +100,42 @@
       </w:r>
     </w:p>
     <w:p/>
+    <w:p>
+      <w:r>
+        <w:t>The pipeline includes a real-time data quality layer using Kafka Streams. Incoming WITSML-like drilling events are validated before being persisted. Clean events are routed to a database sink, while invalid events are sent to a dead-letter topic with failure reasons for later investigation.</w:t>
+      </w:r>
+    </w:p>
     <w:p/>
     <w:p>
+      <w:r>
+        <w:lastRenderedPageBreak/>
+        <w:t xml:space="preserve">“I used </w:t>
+      </w:r>
+      <w:proofErr w:type="spellStart"/>
+      <w:r>
+        <w:t>Apicurio</w:t>
+      </w:r>
+      <w:proofErr w:type="spellEnd"/>
+      <w:r>
+        <w:t xml:space="preserve"> Registry to enforce a schema contract for WITSML-like drilling events, then used Kafka Streams to validate real-time sensor values and route clean data to PostgreSQL while sending invalid data to a bad-data topic for investigation.”</w:t>
+      </w:r>
+    </w:p>
+    <w:p>
+      <w:pPr>
+        <w:rPr>
+          <w:b/>
+          <w:bCs/>
+        </w:rPr>
+      </w:pPr>
+    </w:p>
+    <w:p/>
+    <w:p/>
+    <w:p>
       <w:pPr>
         <w:pStyle w:val="Heading1"/>
       </w:pPr>
       <w:r>
-        <w:t>Future Improvement</w:t>
-      </w:r>
-      <w:r>
-        <w:t>:</w:t>
+        <w:t>Future Improvement:</w:t>
       </w:r>
     </w:p>
     <w:p>

</xml_diff>